<commit_message>
saving old python version
</commit_message>
<xml_diff>
--- a/Briefing_Template.docx
+++ b/Briefing_Template.docx
@@ -1000,7 +1000,7 @@
           <w:rPr>
             <w:noProof/>
           </w:rPr>
-          <w:pict w14:anchorId="0E74281D">
+          <w:pict w14:anchorId="4139DA99">
             <v:shapetype id="_x0000_t136" coordsize="21600,21600" o:spt="136" adj="10800" path="m@7,l@8,m@5,21600l@6,21600e">
               <v:formulas>
                 <v:f eqn="sum #0 0 10800"/>
@@ -2994,10 +2994,38 @@
 </file>
 
 <file path=customXml/item1.xml><?xml version="1.0" encoding="utf-8"?>
-<b:Sources xmlns:b="http://schemas.openxmlformats.org/officeDocument/2006/bibliography" xmlns="http://schemas.openxmlformats.org/officeDocument/2006/bibliography" SelectedStyle="\APASixthEditionOfficeOnline.xsl" StyleName="APA" Version="6"/>
+<p:properties xmlns:p="http://schemas.microsoft.com/office/2006/metadata/properties" xmlns:xsi="http://www.w3.org/2001/XMLSchema-instance" xmlns:pc="http://schemas.microsoft.com/office/infopath/2007/PartnerControls">
+  <documentManagement>
+    <lcf76f155ced4ddcb4097134ff3c332f xmlns="4434dc11-5ca6-45aa-b112-eb35f8425b9b">
+      <Terms xmlns="http://schemas.microsoft.com/office/infopath/2007/PartnerControls"/>
+    </lcf76f155ced4ddcb4097134ff3c332f>
+    <TaxCatchAll xmlns="efce84db-8738-4c7b-9bdc-65b9500871f6" xsi:nil="true"/>
+    <SharedWithUsers xmlns="f4876844-8c29-4ac4-928d-cb03051cfe59">
+      <UserInfo>
+        <DisplayName>Sissi Zheng</DisplayName>
+        <AccountId>24</AccountId>
+        <AccountType/>
+      </UserInfo>
+      <UserInfo>
+        <DisplayName>Brenda D Marion</DisplayName>
+        <AccountId>16</AccountId>
+        <AccountType/>
+      </UserInfo>
+    </SharedWithUsers>
+  </documentManagement>
+</p:properties>
 </file>
 
 <file path=customXml/item2.xml><?xml version="1.0" encoding="utf-8"?>
+<?mso-contentType ?>
+<FormTemplates xmlns="http://schemas.microsoft.com/sharepoint/v3/contenttype/forms">
+  <Display>DocumentLibraryForm</Display>
+  <Edit>DocumentLibraryForm</Edit>
+  <New>DocumentLibraryForm</New>
+</FormTemplates>
+</file>
+
+<file path=customXml/item3.xml><?xml version="1.0" encoding="utf-8"?>
 <ct:contentTypeSchema xmlns:ct="http://schemas.microsoft.com/office/2006/metadata/contentType" xmlns:ma="http://schemas.microsoft.com/office/2006/metadata/properties/metaAttributes" ct:_="" ma:_="" ma:contentTypeName="Document" ma:contentTypeID="0x01010036E3AB64AE2EC94789E55BAA7C176B0F" ma:contentTypeVersion="18" ma:contentTypeDescription="Create a new document." ma:contentTypeScope="" ma:versionID="d6f9cd28a6e4c24f7083eabb1bfa8f25">
   <xsd:schema xmlns:xsd="http://www.w3.org/2001/XMLSchema" xmlns:xs="http://www.w3.org/2001/XMLSchema" xmlns:p="http://schemas.microsoft.com/office/2006/metadata/properties" xmlns:ns2="4434dc11-5ca6-45aa-b112-eb35f8425b9b" xmlns:ns3="efce84db-8738-4c7b-9bdc-65b9500871f6" xmlns:ns4="f4876844-8c29-4ac4-928d-cb03051cfe59" targetNamespace="http://schemas.microsoft.com/office/2006/metadata/properties" ma:root="true" ma:fieldsID="4c6af0a617f7d4825c9db094164c6a92" ns2:_="" ns3:_="" ns4:_="">
     <xsd:import namespace="4434dc11-5ca6-45aa-b112-eb35f8425b9b"/>
@@ -3257,47 +3285,31 @@
 </ct:contentTypeSchema>
 </file>
 
-<file path=customXml/item3.xml><?xml version="1.0" encoding="utf-8"?>
-<?mso-contentType ?>
-<FormTemplates xmlns="http://schemas.microsoft.com/sharepoint/v3/contenttype/forms">
-  <Display>DocumentLibraryForm</Display>
-  <Edit>DocumentLibraryForm</Edit>
-  <New>DocumentLibraryForm</New>
-</FormTemplates>
-</file>
-
 <file path=customXml/item4.xml><?xml version="1.0" encoding="utf-8"?>
-<p:properties xmlns:p="http://schemas.microsoft.com/office/2006/metadata/properties" xmlns:xsi="http://www.w3.org/2001/XMLSchema-instance" xmlns:pc="http://schemas.microsoft.com/office/infopath/2007/PartnerControls">
-  <documentManagement>
-    <lcf76f155ced4ddcb4097134ff3c332f xmlns="4434dc11-5ca6-45aa-b112-eb35f8425b9b">
-      <Terms xmlns="http://schemas.microsoft.com/office/infopath/2007/PartnerControls"/>
-    </lcf76f155ced4ddcb4097134ff3c332f>
-    <TaxCatchAll xmlns="efce84db-8738-4c7b-9bdc-65b9500871f6" xsi:nil="true"/>
-    <SharedWithUsers xmlns="f4876844-8c29-4ac4-928d-cb03051cfe59">
-      <UserInfo>
-        <DisplayName>Sissi Zheng</DisplayName>
-        <AccountId>24</AccountId>
-        <AccountType/>
-      </UserInfo>
-      <UserInfo>
-        <DisplayName>Brenda D Marion</DisplayName>
-        <AccountId>16</AccountId>
-        <AccountType/>
-      </UserInfo>
-    </SharedWithUsers>
-  </documentManagement>
-</p:properties>
+<b:Sources xmlns:b="http://schemas.openxmlformats.org/officeDocument/2006/bibliography" xmlns="http://schemas.openxmlformats.org/officeDocument/2006/bibliography" SelectedStyle="\APASixthEditionOfficeOnline.xsl" StyleName="APA" Version="6"/>
 </file>
 
 <file path=customXml/itemProps1.xml><?xml version="1.0" encoding="utf-8"?>
-<ds:datastoreItem xmlns:ds="http://schemas.openxmlformats.org/officeDocument/2006/customXml" ds:itemID="{76958042-1296-4AC5-BA59-8DCEB676205D}">
+<ds:datastoreItem xmlns:ds="http://schemas.openxmlformats.org/officeDocument/2006/customXml" ds:itemID="{9946F07C-3EC9-4CB5-98B6-207818829719}">
   <ds:schemaRefs>
-    <ds:schemaRef ds:uri="http://schemas.openxmlformats.org/officeDocument/2006/bibliography"/>
+    <ds:schemaRef ds:uri="http://schemas.microsoft.com/office/2006/metadata/properties"/>
+    <ds:schemaRef ds:uri="http://schemas.microsoft.com/office/infopath/2007/PartnerControls"/>
+    <ds:schemaRef ds:uri="4434dc11-5ca6-45aa-b112-eb35f8425b9b"/>
+    <ds:schemaRef ds:uri="efce84db-8738-4c7b-9bdc-65b9500871f6"/>
+    <ds:schemaRef ds:uri="f4876844-8c29-4ac4-928d-cb03051cfe59"/>
   </ds:schemaRefs>
 </ds:datastoreItem>
 </file>
 
 <file path=customXml/itemProps2.xml><?xml version="1.0" encoding="utf-8"?>
+<ds:datastoreItem xmlns:ds="http://schemas.openxmlformats.org/officeDocument/2006/customXml" ds:itemID="{80880406-738C-45EE-9BDC-0331ABDF9A32}">
+  <ds:schemaRefs>
+    <ds:schemaRef ds:uri="http://schemas.microsoft.com/sharepoint/v3/contenttype/forms"/>
+  </ds:schemaRefs>
+</ds:datastoreItem>
+</file>
+
+<file path=customXml/itemProps3.xml><?xml version="1.0" encoding="utf-8"?>
 <ds:datastoreItem xmlns:ds="http://schemas.openxmlformats.org/officeDocument/2006/customXml" ds:itemID="{42F8D051-550D-4E41-914A-D0F0B2331CA1}">
   <ds:schemaRefs>
     <ds:schemaRef ds:uri="http://schemas.microsoft.com/office/2006/metadata/contentType"/>
@@ -3317,22 +3329,10 @@
 </ds:datastoreItem>
 </file>
 
-<file path=customXml/itemProps3.xml><?xml version="1.0" encoding="utf-8"?>
-<ds:datastoreItem xmlns:ds="http://schemas.openxmlformats.org/officeDocument/2006/customXml" ds:itemID="{80880406-738C-45EE-9BDC-0331ABDF9A32}">
+<file path=customXml/itemProps4.xml><?xml version="1.0" encoding="utf-8"?>
+<ds:datastoreItem xmlns:ds="http://schemas.openxmlformats.org/officeDocument/2006/customXml" ds:itemID="{76958042-1296-4AC5-BA59-8DCEB676205D}">
   <ds:schemaRefs>
-    <ds:schemaRef ds:uri="http://schemas.microsoft.com/sharepoint/v3/contenttype/forms"/>
-  </ds:schemaRefs>
-</ds:datastoreItem>
-</file>
-
-<file path=customXml/itemProps4.xml><?xml version="1.0" encoding="utf-8"?>
-<ds:datastoreItem xmlns:ds="http://schemas.openxmlformats.org/officeDocument/2006/customXml" ds:itemID="{9946F07C-3EC9-4CB5-98B6-207818829719}">
-  <ds:schemaRefs>
-    <ds:schemaRef ds:uri="http://schemas.microsoft.com/office/2006/metadata/properties"/>
-    <ds:schemaRef ds:uri="http://schemas.microsoft.com/office/infopath/2007/PartnerControls"/>
-    <ds:schemaRef ds:uri="4434dc11-5ca6-45aa-b112-eb35f8425b9b"/>
-    <ds:schemaRef ds:uri="efce84db-8738-4c7b-9bdc-65b9500871f6"/>
-    <ds:schemaRef ds:uri="f4876844-8c29-4ac4-928d-cb03051cfe59"/>
+    <ds:schemaRef ds:uri="http://schemas.openxmlformats.org/officeDocument/2006/bibliography"/>
   </ds:schemaRefs>
 </ds:datastoreItem>
 </file>
</xml_diff>